<commit_message>
Add second Medium story: meeting notes vs meeting minutes
Original story targeting the notes-vs-minutes query (page one is vendor
blogs), with the same nonprofit board meeting written as formal minutes
and as working notes. Lynkk-style banner and a comparison graphic in
place of a table. make-docx.js now builds both Medium stories.

Co-Authored-By: Claude Opus 5.5 <noreply@anthropic.com>
Claude-Session: https://claude.ai/code/session_013C64pm8XF1oxDj4uMpEd4H
</commit_message>
<xml_diff>
--- a/content/publish/medium-post.docx
+++ b/content/publish/medium-post.docx
@@ -1081,7 +1081,7 @@
       <w:r>
         <w:t xml:space="preserve">Notes are informal and written for the team. Meeting minutes are the formal record a board, committee or association approves, often with motions and votes. The method above works for both, but minutes need a few extra fields (chair, apologies, approval of previous minutes). If that's what you need, here's a </w:t>
       </w:r>
-      <w:hyperlink w:history="1" r:id="rId5aazsrieh35yqb3glulry">
+      <w:hyperlink w:history="1" r:id="rIdujjop4madqxlnj0djlzaj">
         <w:r>
           <w:rPr>
             <w:rStyle w:val="Hyperlink"/>
@@ -1144,7 +1144,7 @@
       <w:r>
         <w:t xml:space="preserve"> Paste a transcript with a well-built prompt. Here's the </w:t>
       </w:r>
-      <w:hyperlink w:history="1" r:id="rId8vzbhkocz99bbecgw8d9j">
+      <w:hyperlink w:history="1" r:id="rIdstjwcoh3olapp_0spdljr">
         <w:r>
           <w:rPr>
             <w:rStyle w:val="Hyperlink"/>
@@ -1175,7 +1175,7 @@
       <w:r>
         <w:t xml:space="preserve"> Tools like </w:t>
       </w:r>
-      <w:hyperlink w:history="1" r:id="rId6sudiyxe0qm0ddydf7orq">
+      <w:hyperlink w:history="1" r:id="rIdr4j7snui0rmjfo6atamq2">
         <w:r>
           <w:rPr>
             <w:rStyle w:val="Hyperlink"/>

</xml_diff>